<commit_message>
docs(report-3): update context, use case, screens flow, and logical ERD diagrams
</commit_message>
<xml_diff>
--- a/docs/review-2/02-reports/report-3-srs/SEP490_FA26SE183_R2_Report3.docx
+++ b/docs/review-2/02-reports/report-3-srs/SEP490_FA26SE183_R2_Report3.docx
@@ -2663,7 +2663,7 @@
         </w:rPr>
         <w:drawing>
           <wp:inline distT="0" distB="0" distL="0" distR="0" wp14:anchorId="7C8F1124" wp14:editId="17919B59">
-            <wp:extent cx="4066309" cy="3049732"/>
+            <wp:extent cx="5486400" cy="2770632"/>
             <wp:effectExtent l="0" t="0" r="0" b="0"/>
             <wp:docPr id="3" name="Picture 3" descr="context diagram"/>
             <wp:cNvGraphicFramePr>
@@ -2687,7 +2687,7 @@
                   <pic:spPr bwMode="auto">
                     <a:xfrm>
                       <a:off x="0" y="0"/>
-                      <a:ext cx="4074978" cy="3056234"/>
+                      <a:ext cx="5486400" cy="2770632"/>
                     </a:xfrm>
                     <a:prstGeom prst="rect">
                       <a:avLst/>
@@ -2705,6 +2705,20 @@
             </a:graphic>
           </wp:inline>
         </w:drawing>
+      </w:r>
+    </w:p>
+    <w:p>
+      <w:pPr>
+        <w:spacing w:before="80" w:after="160"/>
+        <w:jc w:val="center"/>
+      </w:pPr>
+      <w:r>
+        <w:rPr>
+          <w:i/>
+          <w:color w:val="475569"/>
+          <w:sz w:val="20"/>
+        </w:rPr>
+        <w:t>Figure 1. VISTA Platform — System Context Diagram</w:t>
       </w:r>
     </w:p>
     <w:p>
@@ -3090,6 +3104,9 @@
       </w:r>
     </w:p>
     <w:p>
+      <w:pPr>
+        <w:jc w:val="center"/>
+      </w:pPr>
       <w:r>
         <w:rPr>
           <w:noProof/>
@@ -3097,7 +3114,7 @@
         </w:rPr>
         <w:drawing>
           <wp:inline distT="0" distB="0" distL="0" distR="0" wp14:anchorId="4801762E" wp14:editId="7B1F9C2C">
-            <wp:extent cx="5574323" cy="3125933"/>
+            <wp:extent cx="5486400" cy="3063240"/>
             <wp:effectExtent l="0" t="0" r="7620" b="0"/>
             <wp:docPr id="4" name="Picture 4"/>
             <wp:cNvGraphicFramePr>
@@ -3119,7 +3136,7 @@
                   <pic:spPr>
                     <a:xfrm>
                       <a:off x="0" y="0"/>
-                      <a:ext cx="5579153" cy="3128641"/>
+                      <a:ext cx="5486400" cy="3063240"/>
                     </a:xfrm>
                     <a:prstGeom prst="rect">
                       <a:avLst/>
@@ -3130,6 +3147,20 @@
             </a:graphic>
           </wp:inline>
         </w:drawing>
+      </w:r>
+    </w:p>
+    <w:p>
+      <w:pPr>
+        <w:spacing w:before="80" w:after="160"/>
+        <w:jc w:val="center"/>
+      </w:pPr>
+      <w:r>
+        <w:rPr>
+          <w:i/>
+          <w:color w:val="475569"/>
+          <w:sz w:val="20"/>
+        </w:rPr>
+        <w:t>Figure 2. VISTA Platform — Use Case Diagram</w:t>
       </w:r>
     </w:p>
     <w:p>
@@ -3916,7 +3947,7 @@
         </w:rPr>
         <w:drawing>
           <wp:inline distT="0" distB="0" distL="0" distR="0" wp14:anchorId="0652D1C9" wp14:editId="3246AF3D">
-            <wp:extent cx="5048655" cy="2906463"/>
+            <wp:extent cx="5486400" cy="3086100"/>
             <wp:effectExtent l="0" t="0" r="6350" b="1905"/>
             <wp:docPr id="2" name="Picture 2"/>
             <wp:cNvGraphicFramePr>
@@ -3938,7 +3969,7 @@
                   <pic:spPr>
                     <a:xfrm>
                       <a:off x="0" y="0"/>
-                      <a:ext cx="5052244" cy="2908529"/>
+                      <a:ext cx="5486400" cy="3086100"/>
                     </a:xfrm>
                     <a:prstGeom prst="rect">
                       <a:avLst/>
@@ -3949,6 +3980,20 @@
             </a:graphic>
           </wp:inline>
         </w:drawing>
+      </w:r>
+    </w:p>
+    <w:p>
+      <w:pPr>
+        <w:spacing w:before="80" w:after="160"/>
+        <w:jc w:val="center"/>
+      </w:pPr>
+      <w:r>
+        <w:rPr>
+          <w:i/>
+          <w:color w:val="475569"/>
+          <w:sz w:val="20"/>
+        </w:rPr>
+        <w:t>Figure 3. VISTA Platform — Screens &amp; User Navigation Flow</w:t>
       </w:r>
     </w:p>
     <w:p>
@@ -6353,35 +6398,57 @@
       </w:r>
     </w:p>
     <w:p>
+      <w:pPr>
+        <w:spacing w:before="120" w:after="40"/>
+        <w:jc w:val="center"/>
+      </w:pPr>
+      <w:r>
+        <w:drawing>
+          <wp:inline xmlns:a="http://schemas.openxmlformats.org/drawingml/2006/main" xmlns:pic="http://schemas.openxmlformats.org/drawingml/2006/picture">
+            <wp:extent cx="5669280" cy="1959888"/>
+            <wp:docPr id="6" name="Picture 6"/>
+            <wp:cNvGraphicFramePr>
+              <a:graphicFrameLocks noChangeAspect="1"/>
+            </wp:cNvGraphicFramePr>
+            <a:graphic>
+              <a:graphicData uri="http://schemas.openxmlformats.org/drawingml/2006/picture">
+                <pic:pic>
+                  <pic:nvPicPr>
+                    <pic:cNvPr id="0" name="vista_logical_erd.png"/>
+                    <pic:cNvPicPr/>
+                  </pic:nvPicPr>
+                  <pic:blipFill>
+                    <a:blip r:embed="rId19"/>
+                    <a:stretch>
+                      <a:fillRect/>
+                    </a:stretch>
+                  </pic:blipFill>
+                  <pic:spPr>
+                    <a:xfrm>
+                      <a:off x="0" y="0"/>
+                      <a:ext cx="5669280" cy="1959888"/>
+                    </a:xfrm>
+                    <a:prstGeom prst="rect"/>
+                  </pic:spPr>
+                </pic:pic>
+              </a:graphicData>
+            </a:graphic>
+          </wp:inline>
+        </w:drawing>
+      </w:r>
+    </w:p>
+    <w:p>
+      <w:pPr>
+        <w:spacing w:before="80" w:after="160"/>
+        <w:jc w:val="center"/>
+      </w:pPr>
       <w:r>
         <w:rPr>
-          <w:noProof/>
+          <w:i/>
+          <w:color w:val="475569"/>
+          <w:sz w:val="20"/>
         </w:rPr>
-        <w:object w:dxaOrig="12036" w:dyaOrig="6253" w14:anchorId="5CBD78DF">
-          <v:shapetype id="_x0000_t75" coordsize="21600,21600" o:spt="75" o:preferrelative="t" path="m@4@5l@4@11@9@11@9@5xe" filled="f" stroked="f">
-            <v:stroke joinstyle="miter"/>
-            <v:formulas>
-              <v:f eqn="if lineDrawn pixelLineWidth 0"/>
-              <v:f eqn="sum @0 1 0"/>
-              <v:f eqn="sum 0 0 @1"/>
-              <v:f eqn="prod @2 1 2"/>
-              <v:f eqn="prod @3 21600 pixelWidth"/>
-              <v:f eqn="prod @3 21600 pixelHeight"/>
-              <v:f eqn="sum @0 0 1"/>
-              <v:f eqn="prod @6 1 2"/>
-              <v:f eqn="prod @7 21600 pixelWidth"/>
-              <v:f eqn="sum @8 21600 0"/>
-              <v:f eqn="prod @7 21600 pixelHeight"/>
-              <v:f eqn="sum @10 21600 0"/>
-            </v:formulas>
-            <v:path o:extrusionok="f" gradientshapeok="t" o:connecttype="rect"/>
-            <o:lock v:ext="edit" aspectratio="t"/>
-          </v:shapetype>
-          <v:shape id="_x0000_i1025" type="#_x0000_t75" alt="" style="width:451.95pt;height:234.85pt;mso-width-percent:0;mso-height-percent:0;mso-width-percent:0;mso-height-percent:0" o:ole="">
-            <v:imagedata r:id="rId12" o:title=""/>
-          </v:shape>
-          <o:OLEObject Type="Embed" ProgID="Visio.Drawing.15" ShapeID="_x0000_i1025" DrawAspect="Content" ObjectID="_1693962696" r:id="rId13"/>
-        </w:object>
+        <w:t>Figure 4. VISTA Platform — Logical ERD (School &amp; Access Scope)</w:t>
       </w:r>
     </w:p>
     <w:p>
@@ -6707,63 +6774,6 @@
       </w:pPr>
       <w:r>
         <w:t>API: GET /api/v1/education-admin/classrooms/:classroomId/eligible-robots; PUT /api/v1/education-admin/classrooms/:classroomId/robot-allocation.</w:t>
-      </w:r>
-    </w:p>
-    <w:p>
-      <w:pPr>
-        <w:pStyle w:val="ListParagraph"/>
-        <w:rPr>
-          <w:i/>
-        </w:rPr>
-      </w:pPr>
-      <w:r>
-        <w:rPr>
-          <w:i/>
-          <w:noProof/>
-          <w:lang w:val="en-US"/>
-        </w:rPr>
-        <w:drawing>
-          <wp:inline distT="0" distB="0" distL="0" distR="0" wp14:anchorId="5EBA7135" wp14:editId="3195F89D">
-            <wp:extent cx="5269523" cy="2738405"/>
-            <wp:effectExtent l="19050" t="19050" r="26670" b="24130"/>
-            <wp:docPr id="9" name="Picture 9"/>
-            <wp:cNvGraphicFramePr>
-              <a:graphicFrameLocks xmlns:a="http://schemas.openxmlformats.org/drawingml/2006/main" noChangeAspect="1"/>
-            </wp:cNvGraphicFramePr>
-            <a:graphic xmlns:a="http://schemas.openxmlformats.org/drawingml/2006/main">
-              <a:graphicData uri="http://schemas.openxmlformats.org/drawingml/2006/picture">
-                <pic:pic xmlns:pic="http://schemas.openxmlformats.org/drawingml/2006/picture">
-                  <pic:nvPicPr>
-                    <pic:cNvPr id="1" name=""/>
-                    <pic:cNvPicPr/>
-                  </pic:nvPicPr>
-                  <pic:blipFill>
-                    <a:blip r:embed="rId14"/>
-                    <a:stretch>
-                      <a:fillRect/>
-                    </a:stretch>
-                  </pic:blipFill>
-                  <pic:spPr>
-                    <a:xfrm>
-                      <a:off x="0" y="0"/>
-                      <a:ext cx="5278510" cy="2743075"/>
-                    </a:xfrm>
-                    <a:prstGeom prst="rect">
-                      <a:avLst/>
-                    </a:prstGeom>
-                    <a:ln>
-                      <a:solidFill>
-                        <a:schemeClr val="bg2">
-                          <a:lumMod val="75000"/>
-                        </a:schemeClr>
-                      </a:solidFill>
-                    </a:ln>
-                  </pic:spPr>
-                </pic:pic>
-              </a:graphicData>
-            </a:graphic>
-          </wp:inline>
-        </w:drawing>
       </w:r>
     </w:p>
     <w:p>

</xml_diff>

<commit_message>
docs(report-3): restructure sections 3.2-3.5 for WF01-WF04 and remove drafting note
</commit_message>
<xml_diff>
--- a/docs/review-2/02-reports/report-3-srs/SEP490_FA26SE183_R2_Report3.docx
+++ b/docs/review-2/02-reports/report-3-srs/SEP490_FA26SE183_R2_Report3.docx
@@ -3897,7 +3897,7 @@
     </w:p>
     <w:p>
       <w:r>
-        <w:t>The functional baseline uses FR-01 to FR-06 and four workflows. Scope must remain consistent with Registration v1.2 and actual API authorization. Expected errors include unauthorized org/classroom scope, invalid entitlement, invalid submission ownership, and non-schematic experiment mode.</w:t>
+        <w:t>The functional baseline encompasses eight mandatory functional requirements (FR-01 to FR-08) structured across four core workflows (WF-01 to WF-04). Scope remains consistent with Registration v1.2 and verified API authorization. Expected error flows include unauthorized organization or classroom scope, invalid resource entitlement, foreign submission tampering, and unsupported execution modes.</w:t>
       </w:r>
     </w:p>
     <w:p>
@@ -6803,20 +6803,120 @@
     </w:p>
     <w:p>
       <w:pPr>
+        <w:pStyle w:val="Heading3"/>
+      </w:pPr>
+      <w:r>
+        <w:t>3.3 WF-02 Learning Content and Assignment Management</w:t>
+      </w:r>
+    </w:p>
+    <w:p>
+      <w:pPr/>
+      <w:r>
+        <w:t>FR-03 &amp; FR-04: Teacher manages and publishes classroom assignments; Student accesses learning lessons, develops visual robot programs with immutable versioning, and submits assignment attempts. All actions are scoped to verified classroom enrollment.</w:t>
+      </w:r>
+    </w:p>
+    <w:p>
+      <w:pPr>
         <w:pStyle w:val="Heading4"/>
       </w:pPr>
       <w:r>
-        <w:t>3.2.2 WF-02 Learning &amp; Assignment; WF-03 Experiment; WF-04 Assessment</w:t>
-      </w:r>
-    </w:p>
-    <w:p>
-      <w:r>
-        <w:t>WF-02 FR-03/04: Teacher prepares/publishes classroom assignment, learner versions program and submits own work. WF-03 FR-05: create schematic experiment request; reject any unsupported executionMode; pending is NOT physical run completion. WF-04 FR-06: authorized teacher reviews submission and records assessment/feedback; integration of AI metadata is separately scoped.</w:t>
-      </w:r>
-    </w:p>
-    <w:p>
-      <w:r>
-        <w:t>WF-02: teacher delivers/publishes assignment, student creates attempt and versioned RobotProgram, then submits authorized immutable version.</w:t>
+        <w:t>3.3.1 Teacher Publishes Assignment</w:t>
+      </w:r>
+    </w:p>
+    <w:p>
+      <w:pPr/>
+      <w:r>
+        <w:t>Precondition: authenticated teacher with active classroom assignment role. Main: teacher defines assignment criteria, rubric guidelines, and submission deadlines; publishes assignment to enrolled students. Exception: unauthorized teacher access or foreign classroom modification rejected.</w:t>
+      </w:r>
+    </w:p>
+    <w:p>
+      <w:pPr/>
+      <w:r>
+        <w:t>Trigger: Teacher creates and confirms classroom assignment publication.</w:t>
+      </w:r>
+    </w:p>
+    <w:p>
+      <w:pPr>
+        <w:pStyle w:val="ListParagraph"/>
+      </w:pPr>
+      <w:r>
+        <w:t>• Validation: active teacher membership, ownership of target classroom, valid rubric criteria definition.</w:t>
+      </w:r>
+    </w:p>
+    <w:p>
+      <w:pPr>
+        <w:pStyle w:val="ListParagraph"/>
+      </w:pPr>
+      <w:r>
+        <w:t>• Result: assignment status transitions to PUBLISHED; enrolled students receive access to task brief.</w:t>
+      </w:r>
+    </w:p>
+    <w:p>
+      <w:pPr>
+        <w:pStyle w:val="ListParagraph"/>
+      </w:pPr>
+      <w:r>
+        <w:t>• API: POST /api/v1/education/classrooms/:classroomId/assignments; GET /api/v1/education/assignments/:id.</w:t>
+      </w:r>
+    </w:p>
+    <w:p>
+      <w:pPr>
+        <w:pStyle w:val="ListParagraph"/>
+      </w:pPr>
+      <w:r>
+        <w:t>• Failure: unassigned teacher or invalid classroom returns 403 Forbidden.</w:t>
+      </w:r>
+    </w:p>
+    <w:p>
+      <w:pPr>
+        <w:pStyle w:val="Heading4"/>
+      </w:pPr>
+      <w:r>
+        <w:t>3.3.2 Student Creates and Submits Program Version</w:t>
+      </w:r>
+    </w:p>
+    <w:p>
+      <w:pPr/>
+      <w:r>
+        <w:t>Precondition: authenticated student enrolled in classroom with an active published assignment. Main: student opens visual Blockly workspace, writes robot program, saves immutable versions with SHA-256 integrity hash, and submits version for assignment attempt. Exception: submission after deadline without extension or cross-student attempt tampering rejected.</w:t>
+      </w:r>
+    </w:p>
+    <w:p>
+      <w:pPr/>
+      <w:r>
+        <w:t>Trigger: Student clicks "Submit Version" for an active attempt.</w:t>
+      </w:r>
+    </w:p>
+    <w:p>
+      <w:pPr>
+        <w:pStyle w:val="ListParagraph"/>
+      </w:pPr>
+      <w:r>
+        <w:t>• Validation: active student enrollment, attempt ownership, program AST syntactic validity.</w:t>
+      </w:r>
+    </w:p>
+    <w:p>
+      <w:pPr>
+        <w:pStyle w:val="ListParagraph"/>
+      </w:pPr>
+      <w:r>
+        <w:t>• Result: immutable program version created; submission record logged with status SUBMITTED.</w:t>
+      </w:r>
+    </w:p>
+    <w:p>
+      <w:pPr>
+        <w:pStyle w:val="ListParagraph"/>
+      </w:pPr>
+      <w:r>
+        <w:t>• API: POST /api/v1/education/programs/:programId/versions; POST /api/v1/education/submissions.</w:t>
+      </w:r>
+    </w:p>
+    <w:p>
+      <w:pPr>
+        <w:pStyle w:val="ListParagraph"/>
+      </w:pPr>
+      <w:r>
+        <w:t>• Failure: foreign attempt modification or empty program AST returns 400/403.</w:t>
       </w:r>
     </w:p>
     <w:p>
@@ -6824,15 +6924,235 @@
         <w:pStyle w:val="Heading3"/>
       </w:pPr>
       <w:r>
-        <w:t>WF-03: ExperimentService currently accepts schematic mode only; creation starts pending and separate schematic/symbolic evaluation actions exist. Do not present physical execution as implemented.</w:t>
-      </w:r>
-    </w:p>
-    <w:p>
-      <w:r/>
-    </w:p>
-    <w:p>
-      <w:r>
-        <w:br w:type="page"/>
+        <w:t>3.4 WF-03 Robot Experiment Execution</w:t>
+      </w:r>
+    </w:p>
+    <w:p>
+      <w:pPr/>
+      <w:r>
+        <w:t>FR-05 &amp; FR-06: Student requests experiment run against submitted program version. Education API executes deterministic schematic simulation and records execution artifacts. Physical robot execution via CHECKIK runtime requires explicit reservation and verified hardware safety readiness.</w:t>
+      </w:r>
+    </w:p>
+    <w:p>
+      <w:pPr>
+        <w:pStyle w:val="Heading4"/>
+      </w:pPr>
+      <w:r>
+        <w:t>3.4.1 Schematic Experiment Simulation</w:t>
+      </w:r>
+    </w:p>
+    <w:p>
+      <w:pPr/>
+      <w:r>
+        <w:t>Precondition: authenticated student with valid program version. Main: student initiates schematic run; backend validates AST schema, executes deterministic kinematic simulation, persists trajectory coordinates and score evidence. Exception: invalid AST or unsupported execution mode returns validation error.</w:t>
+      </w:r>
+    </w:p>
+    <w:p>
+      <w:pPr/>
+      <w:r>
+        <w:t>Trigger: Student requests schematic execution in Experiment Console.</w:t>
+      </w:r>
+    </w:p>
+    <w:p>
+      <w:pPr>
+        <w:pStyle w:val="ListParagraph"/>
+      </w:pPr>
+      <w:r>
+        <w:t>• Validation: student submission ownership, supported executionMode (schematic), validated program AST.</w:t>
+      </w:r>
+    </w:p>
+    <w:p>
+      <w:pPr>
+        <w:pStyle w:val="ListParagraph"/>
+      </w:pPr>
+      <w:r>
+        <w:t>• Result: experiment record created; deterministic simulation executed; trajectory artifact persisted with status COMPLETED.</w:t>
+      </w:r>
+    </w:p>
+    <w:p>
+      <w:pPr>
+        <w:pStyle w:val="ListParagraph"/>
+      </w:pPr>
+      <w:r>
+        <w:t>• API: POST /api/v1/education/experiments; GET /api/v1/education/experiments/:id.</w:t>
+      </w:r>
+    </w:p>
+    <w:p>
+      <w:pPr>
+        <w:pStyle w:val="ListParagraph"/>
+      </w:pPr>
+      <w:r>
+        <w:t>• Failure: unsupported execution mode returns 400 Bad Request.</w:t>
+      </w:r>
+    </w:p>
+    <w:p>
+      <w:pPr>
+        <w:pStyle w:val="Heading4"/>
+      </w:pPr>
+      <w:r>
+        <w:t>3.4.2 Physical Robot Execution Boundary</w:t>
+      </w:r>
+    </w:p>
+    <w:p>
+      <w:pPr/>
+      <w:r>
+        <w:t>Precondition: active robot reservation, verified safety boundary, and connected CHECKIK robot runtime. Main: authorized dispatch service sends bounded pick-and-place command sequence to local robot runtime; receives telemetry and execution evidence. Exception: safety trigger or hardware disconnect aborts execution immediately (fail-closed).</w:t>
+      </w:r>
+    </w:p>
+    <w:p>
+      <w:pPr/>
+      <w:r>
+        <w:t>Trigger: Authorized run request dispatched to reserved physical robot.</w:t>
+      </w:r>
+    </w:p>
+    <w:p>
+      <w:pPr>
+        <w:pStyle w:val="ListParagraph"/>
+      </w:pPr>
+      <w:r>
+        <w:t>• Validation: active reservation window, hardware calibration check passed, safety profile active.</w:t>
+      </w:r>
+    </w:p>
+    <w:p>
+      <w:pPr>
+        <w:pStyle w:val="ListParagraph"/>
+      </w:pPr>
+      <w:r>
+        <w:t>• Result: physical robot performs bounded tabletop manipulation; runtime returns execution telemetry.</w:t>
+      </w:r>
+    </w:p>
+    <w:p>
+      <w:pPr>
+        <w:pStyle w:val="ListParagraph"/>
+      </w:pPr>
+      <w:r>
+        <w:t>• API: POST /api/v1/robot-runtime/dispatch; GET /api/v1/robot-runtime/telemetry.</w:t>
+      </w:r>
+    </w:p>
+    <w:p>
+      <w:pPr>
+        <w:pStyle w:val="ListParagraph"/>
+      </w:pPr>
+      <w:r>
+        <w:t>• Failure: hardware fault or emergency stop triggers immediate halt and records safety event.</w:t>
+      </w:r>
+    </w:p>
+    <w:p>
+      <w:pPr>
+        <w:pStyle w:val="Heading3"/>
+      </w:pPr>
+      <w:r>
+        <w:t>3.5 WF-04 Assessment, Feedback and AI Integration</w:t>
+      </w:r>
+    </w:p>
+    <w:p>
+      <w:pPr/>
+      <w:r>
+        <w:t>FR-07 &amp; FR-08: Authorized teacher assesses student submission, scores rubric criteria, and delivers qualitative feedback. Student reviews feedback and logs learning reflections. Platform serves traceable read-only AI model metadata and training dataset lineage.</w:t>
+      </w:r>
+    </w:p>
+    <w:p>
+      <w:pPr>
+        <w:pStyle w:val="Heading4"/>
+      </w:pPr>
+      <w:r>
+        <w:t>3.5.1 Teacher Assessment and Rubric Scoring</w:t>
+      </w:r>
+    </w:p>
+    <w:p>
+      <w:pPr/>
+      <w:r>
+        <w:t>Precondition: authenticated teacher assigned to classroom with student submission in SUBMITTED state. Main: teacher reviews submission evidence, executes comparison runs, assigns scores per rubric criterion, and publishes written feedback. Exception: foreign teacher access or grading without assignment scope rejected.</w:t>
+      </w:r>
+    </w:p>
+    <w:p>
+      <w:pPr/>
+      <w:r>
+        <w:t>Trigger: Teacher submits completed assessment for student submission.</w:t>
+      </w:r>
+    </w:p>
+    <w:p>
+      <w:pPr>
+        <w:pStyle w:val="ListParagraph"/>
+      </w:pPr>
+      <w:r>
+        <w:t>• Validation: teacher classroom authorization, submission ownership, valid score range per criterion.</w:t>
+      </w:r>
+    </w:p>
+    <w:p>
+      <w:pPr>
+        <w:pStyle w:val="ListParagraph"/>
+      </w:pPr>
+      <w:r>
+        <w:t>• Result: assessment record persisted; submission transitions to ASSESSED; student reflection unlocked.</w:t>
+      </w:r>
+    </w:p>
+    <w:p>
+      <w:pPr>
+        <w:pStyle w:val="ListParagraph"/>
+      </w:pPr>
+      <w:r>
+        <w:t>• API: POST /api/v1/education/submissions/:submissionId/assessment; GET /api/v1/education/assessments/:id.</w:t>
+      </w:r>
+    </w:p>
+    <w:p>
+      <w:pPr>
+        <w:pStyle w:val="ListParagraph"/>
+      </w:pPr>
+      <w:r>
+        <w:t>• Failure: unauthorized teacher returns 403 Forbidden.</w:t>
+      </w:r>
+    </w:p>
+    <w:p>
+      <w:pPr>
+        <w:pStyle w:val="Heading4"/>
+      </w:pPr>
+      <w:r>
+        <w:t>3.5.2 Student Reflection and AI Metadata Inspection</w:t>
+      </w:r>
+    </w:p>
+    <w:p>
+      <w:pPr/>
+      <w:r>
+        <w:t>Precondition: authenticated student with assessed submission; or authorized user inspecting AI models. Main: student enters qualitative reflection notes based on teacher feedback; user inspects AI model cards, training datasets, and performance evaluation metrics. Exception: reflection on unassessed submission rejected.</w:t>
+      </w:r>
+    </w:p>
+    <w:p>
+      <w:pPr/>
+      <w:r>
+        <w:t>Trigger: Student submits reflection notes or user views AI model registry.</w:t>
+      </w:r>
+    </w:p>
+    <w:p>
+      <w:pPr>
+        <w:pStyle w:val="ListParagraph"/>
+      </w:pPr>
+      <w:r>
+        <w:t>• Validation: student attempt ownership; valid model card identifier.</w:t>
+      </w:r>
+    </w:p>
+    <w:p>
+      <w:pPr>
+        <w:pStyle w:val="ListParagraph"/>
+      </w:pPr>
+      <w:r>
+        <w:t>• Result: student reflection saved to submission history; AI model metadata and lineage displayed.</w:t>
+      </w:r>
+    </w:p>
+    <w:p>
+      <w:pPr>
+        <w:pStyle w:val="ListParagraph"/>
+      </w:pPr>
+      <w:r>
+        <w:t>• API: POST /api/v1/education/submissions/:submissionId/reflection; GET /api/v1/ai-models.</w:t>
+      </w:r>
+    </w:p>
+    <w:p>
+      <w:pPr>
+        <w:pStyle w:val="ListParagraph"/>
+      </w:pPr>
+      <w:r>
+        <w:t>• Failure: invalid submission ID or unauthenticated request returns 401/404.</w:t>
       </w:r>
     </w:p>
     <w:p>

</xml_diff>